<commit_message>
Reference program email in TEC/WES evaluation note
Co-Authored-By: Claude Sonnet 5.5 <noreply@anthropic.com>
Claude-Session: https://claude.ai/code/session_01XUDyFYyGzasKczt6BdhMcR
</commit_message>
<xml_diff>
--- a/TAMU_SCA/notes/Note_Evaluation_Not_Required.docx
+++ b/TAMU_SCA/notes/Note_Evaluation_Not_Required.docx
@@ -22,12 +22,25 @@
     </w:p>
     <w:p>
       <w:r>
-        <w:t>I hold a Bachelor of Business Administration (Finance, Investment and Banking) from the University of Wisconsin–Madison, a U.S. institution, conferred on August 25, 2013. My cumulative GPA is 3.457 on a 4.0 scale. My UW–Madison transcript is included in this application.</w:t>
+        <w:t>I hold a Bachelor of Business Administration (Finance, Investment and Banking) from the University of Wisconsin–Madison, a U.S. institution, conferred on August 25, 2013. My cumulative GPA is 3.457 on a 4.0 scale.</w:t>
       </w:r>
     </w:p>
     <w:p>
       <w:r>
-        <w:t>Because my undergraduate degree is from a U.S. institution, I understand that a TEC or WES evaluation is not required. This note is uploaded in place of an evaluation report, as advised by the program.</w:t>
+        <w:t>Two parts of my record were completed outside the U.S.: a Fall 2012 exchange semester at the National University of Singapore, and a 2008 summer program at Korea University. I asked the program whether an evaluation is required for them, and Jana Sprayberry of the MS-SCAN program replied by email:</w:t>
+      </w:r>
+    </w:p>
+    <w:p>
+      <w:pPr>
+        <w:ind w:left="720" w:right="720"/>
+      </w:pPr>
+      <w:r>
+        <w:t>“Since your grades are on your transcript for UW Madison with grades and not a T for transfer then no, you do not need that transcript evaluated. In addition the 6 hours from Korea University is not part of the application GPA calculation, and you do not have a degree from there, so no evaluation needed.”</w:t>
+      </w:r>
+    </w:p>
+    <w:p>
+      <w:r>
+        <w:t>This note is uploaded in place of an evaluation report, as advised by the program.</w:t>
       </w:r>
     </w:p>
     <w:p>

</xml_diff>

<commit_message>
Make TEC/WES note fact-only
Co-Authored-By: Claude Sonnet 5.5 <noreply@anthropic.com>
Claude-Session: https://claude.ai/code/session_01XUDyFYyGzasKczt6BdhMcR
</commit_message>
<xml_diff>
--- a/TAMU_SCA/notes/Note_Evaluation_Not_Required.docx
+++ b/TAMU_SCA/notes/Note_Evaluation_Not_Required.docx
@@ -22,25 +22,36 @@
     </w:p>
     <w:p>
       <w:r>
-        <w:t>I hold a Bachelor of Business Administration (Finance, Investment and Banking) from the University of Wisconsin–Madison, a U.S. institution, conferred on August 25, 2013. My cumulative GPA is 3.457 on a 4.0 scale.</w:t>
+        <w:t>A TEC or WES evaluation is not required for my application, for the following reasons:</w:t>
+      </w:r>
+    </w:p>
+    <w:p>
+      <w:pPr>
+        <w:pStyle w:val="ListBullet"/>
+      </w:pPr>
+      <w:r>
+        <w:t>I hold a Bachelor of Business Administration from the University of Wisconsin–Madison, a U.S. institution, conferred on August 25, 2013 (cumulative GPA 3.457/4.0).</w:t>
+      </w:r>
+    </w:p>
+    <w:p>
+      <w:pPr>
+        <w:pStyle w:val="ListBullet"/>
+      </w:pPr>
+      <w:r>
+        <w:t>My Fall 2012 exchange semester at the National University of Singapore appears on my UW–Madison transcript with letter grades, not as transfer (T) credit.</w:t>
+      </w:r>
+    </w:p>
+    <w:p>
+      <w:pPr>
+        <w:pStyle w:val="ListBullet"/>
+      </w:pPr>
+      <w:r>
+        <w:t>The 6 credit hours from Korea University (2008 summer program) are not part of the application GPA calculation, and I do not hold a degree from that institution.</w:t>
       </w:r>
     </w:p>
     <w:p>
       <w:r>
-        <w:t>Two parts of my record were completed outside the U.S.: a Fall 2012 exchange semester at the National University of Singapore, and a 2008 summer program at Korea University. I asked the program whether an evaluation is required for them, and Jana Sprayberry of the MS-SCAN program replied by email:</w:t>
-      </w:r>
-    </w:p>
-    <w:p>
-      <w:pPr>
-        <w:ind w:left="720" w:right="720"/>
-      </w:pPr>
-      <w:r>
-        <w:t>“Since your grades are on your transcript for UW Madison with grades and not a T for transfer then no, you do not need that transcript evaluated. In addition the 6 hours from Korea University is not part of the application GPA calculation, and you do not have a degree from there, so no evaluation needed.”</w:t>
-      </w:r>
-    </w:p>
-    <w:p>
-      <w:r>
-        <w:t>This note is uploaded in place of an evaluation report, as advised by the program.</w:t>
+        <w:t>This note is uploaded in place of an evaluation report.</w:t>
       </w:r>
     </w:p>
     <w:p>

</xml_diff>